<commit_message>
Add Feishu integration workflow
</commit_message>
<xml_diff>
--- a/提交材料/03_平台原型说明.docx
+++ b/提交材料/03_平台原型说明.docx
@@ -34,6 +34,19 @@
     <w:p>
       <w:r>
         <w:t>运行 python scripts/run_quality_agent.py 可模拟异常评分、案例召回、证据链和任务生成。</w:t>
+      </w:r>
+    </w:p>
+    <w:p>
+      <w:pPr>
+        <w:pStyle w:val="Heading1"/>
+      </w:pPr>
+      <w:r>
+        <w:t>飞书集成demo</w:t>
+      </w:r>
+    </w:p>
+    <w:p>
+      <w:r>
+        <w:t>运行 python scripts/feishu_client.py --event-id E-20260717-001 --write-preview 可生成多维表格记录、任务记录、Webhook卡片和Aily提示词。默认dry-run，配置环境变量并追加 --send 后才调用真实接口。</w:t>
       </w:r>
     </w:p>
     <w:p>

</xml_diff>